<commit_message>
Add concise 'Design choice: single-agent + tool-use' to report
Two short paragraphs at the end of section 4:
1. Confirm what we built qualifies as an agent and meets the assignment's
   deliberate-workflow bar.
2. Explain the fundamental reason for single-agent over multi-agent: the
   task does not require specialisation; keeping reasoning continuous
   beats multiplying round trips. Forward-points to Section 9 for the
   Critic-agent extension when richer agency is warranted.

Section 9 gains 'Add an online Critic agent' as the first improvement
bullet so the cross-reference holds.

No code changes; report.docx regenerated.

Co-Authored-By: Claude Opus 4.7 <noreply@anthropic.com>
</commit_message>
<xml_diff>
--- a/report/report.docx
+++ b/report/report.docx
@@ -1763,6 +1763,32 @@
           <w:i w:val="0"/>
         </w:rPr>
         <w:t>The answer named AgentVYJS, AgentTXPF, and AgentTVAX; quoted the Hinglish urgency cue "Thoda jaldi please, flight in 2 hours" and the repeated scripted agent reply "I understand this is frustrating. I'm investigating now."; and identified four concrete coaching themes (personalising empathy, reading urgency cues, avoiding off-topic replies, offering escalation paths). Total wall-clock time: 75 seconds.</w:t>
+      </w:r>
+    </w:p>
+    <w:p>
+      <w:pPr>
+        <w:pStyle w:val="Heading2"/>
+      </w:pPr>
+      <w:r>
+        <w:t>Design choice: single-agent + tool-use</w:t>
+      </w:r>
+    </w:p>
+    <w:p>
+      <w:r>
+        <w:rPr>
+          <w:b w:val="0"/>
+          <w:i w:val="0"/>
+        </w:rPr>
+        <w:t>The design is one Sonnet 4.6 call running a tool-use loop with a structured-output sink. It qualifies as an agent (autonomous tool selection, state-aware iteration, self-termination) and meets the assignment's bar of a deliberate workflow rather than a single prompt.</w:t>
+      </w:r>
+    </w:p>
+    <w:p>
+      <w:r>
+        <w:rPr>
+          <w:b w:val="0"/>
+          <w:i w:val="0"/>
+        </w:rPr>
+        <w:t>We chose single-agent + tool-use over a multi-agent design (orchestrator + specialised sub-agents) because the task does not require specialisation: the same model decides which slice of data to fetch, reads the result, and writes the synthesis. Keeping that in one continuous context preserves reasoning across the 1-11 tool calls a single question may need, with no handoff loss between sub-agents and without multiplying Anthropic round trips. The natural extension when richer agency is justified is a Critic agent — listed as the highest-leverage item in Section 9.</w:t>
       </w:r>
     </w:p>
     <w:p>
@@ -5106,6 +5132,14 @@
         <w:pStyle w:val="ListBullet"/>
       </w:pPr>
       <w:r>
+        <w:t>Add an online Critic agent (highest leverage). Today the system is a single-agent + tool-use loop (Section 4). The cheapest upgrade to a genuine multi-agent workflow is a post-emit_answer Haiku call that reads (question, answer, evidence, tool_calls) and judges grounding sufficiency. When grounding is weak the critic emits structured feedback — "the claim about Financial Products lacks supporting evidence" — and the planner runs one more retrieval pass before re-emitting. This directly targets the three weakest eval grounding scores (q06 0.65, q08 0.75, q09 0.75) at ~$0.005 and ~5s per question.</w:t>
+      </w:r>
+    </w:p>
+    <w:p>
+      <w:pPr>
+        <w:pStyle w:val="ListBullet"/>
+      </w:pPr>
+      <w:r>
         <w:t>Generalise topic extraction. Replace the regex template bank with an LLM-based slot extractor OR an embedding-cluster-then-label approach (multilingual embeddings + HDBSCAN + LLM cluster labelling). The plug-in points already exist behind extract_slot().</w:t>
       </w:r>
     </w:p>

</xml_diff>

<commit_message>
Trim and update report; add preprocess/agent flow to README
- report: remove input/output blocks from all 6 tools (keep examples only)
- report: remove 'Important pieces' bullets from 3.1/3.2, Responsibilities
  section from 4, grounding grader description from 6.1
- report: collapse 6.5/6.6 to one example each; make them data-driven so
  agent names, tool counts, and grounding scores pull from results-latest.json
- report: shorten 7.3 memory to one paragraph; remove item 4 from section 8
- report: fix stale hardcoded latency figures (p95 60s→44s, 60-75s→40-50s)
- report: sync eval numbers from results-baseline.json (100% pass, 29.6s mean)
- README: add Preprocess pipeline and Agent flow sections at the end

Co-Authored-By: Claude Sonnet 4.6 <noreply@anthropic.com>
</commit_message>
<xml_diff>
--- a/report/report.docx
+++ b/report/report.docx
@@ -175,31 +175,7 @@
         <w:pStyle w:val="ListBullet"/>
       </w:pPr>
       <w:r>
-        <w:t>Only ~426 distinct cleaned sentences exist across 42,000 turns — so we label each distinct sentence once and copy the labels onto every matching turn, ~100× cheaper than labelling each turn separately.</w:t>
-      </w:r>
-    </w:p>
-    <w:p>
-      <w:pPr>
-        <w:pStyle w:val="ListBullet"/>
-      </w:pPr>
-      <w:r>
         <w:t>Per-turn timestamps are noisy (not monotonic within a conversation) — so we use the turn index column for ordering and the earliest timestamp as the conversation's start time.</w:t>
-      </w:r>
-    </w:p>
-    <w:p>
-      <w:pPr>
-        <w:pStyle w:val="ListBullet"/>
-      </w:pPr>
-      <w:r>
-        <w:t>Only the cleaned leading sentence of each turn carries signal; the trailing characters are random gibberish — so cleaning is just 'keep everything up to the last sentence-ending punctuation', no fancy parsing needed.</w:t>
-      </w:r>
-    </w:p>
-    <w:p>
-      <w:pPr>
-        <w:pStyle w:val="ListBullet"/>
-      </w:pPr>
-      <w:r>
-        <w:t>Each customer maps to exactly one conversation — so customer-level views and conversation-level views are equivalent; no extra deduplication needed.</w:t>
       </w:r>
     </w:p>
     <w:p>
@@ -1127,7 +1103,7 @@
         <w:pStyle w:val="ListBullet"/>
       </w:pPr>
       <w:r>
-        <w:t>Sentiment label: neu=19,308, neg=11,577, pos=11,080</w:t>
+        <w:t>Sentiment label: neu=22,195, neg=11,599, pos=8,171</w:t>
       </w:r>
     </w:p>
     <w:p>
@@ -1135,7 +1111,7 @@
         <w:pStyle w:val="ListBullet"/>
       </w:pPr>
       <w:r>
-        <w:t>Language: en=35,398, hi=6,248, mixed=319 — ~16% non-English (Hindi/Hinglish + mixed).</w:t>
+        <w:t>Language: en=35,398, hi=6,266, mixed=301 — ~16% non-English (Hindi/Hinglish + mixed).</w:t>
       </w:r>
     </w:p>
     <w:p>
@@ -1143,7 +1119,7 @@
         <w:pStyle w:val="ListBullet"/>
       </w:pPr>
       <w:r>
-        <w:t>Agent empathy (agent turns only): empathetic=8,794, neutral=11,532 — 0 dismissive agent turns reflects the uniformly polite synthetic data.</w:t>
+        <w:t>Agent empathy (agent turns only): empathetic=9,305, neutral=11,021</w:t>
       </w:r>
     </w:p>
     <w:p>
@@ -1357,7 +1333,7 @@
           <w:b w:val="0"/>
           <w:i w:val="0"/>
         </w:rPr>
-        <w:t>Two clearly separated parts: a preprocessing pipeline that runs once offline to turn the raw CSV into labelled, searchable data, and an online serving path that uses an AI agent to answer questions over that data.</w:t>
+        <w:t>Two clearly separated parts: a preprocessing pipeline that runs once offline to turn the raw CSV into labelled, searchable data, and an actual systsem that uses an AI agent to answer questions over that data.</w:t>
       </w:r>
     </w:p>
     <w:p>
@@ -1365,7 +1341,7 @@
         <w:pStyle w:val="Heading2"/>
       </w:pPr>
       <w:r>
-        <w:t>3.1 Preprocessing pipeline (offline, one-shot)</w:t>
+        <w:t>3.1 Preprocessing pipeline (offline, one-time run)</w:t>
       </w:r>
     </w:p>
     <w:p>
@@ -1438,60 +1414,11 @@
       </w:r>
     </w:p>
     <w:p>
-      <w:r>
-        <w:rPr>
-          <w:b w:val="0"/>
-          <w:i w:val="0"/>
-        </w:rPr>
-        <w:t>Important pieces (high level):</w:t>
-      </w:r>
-    </w:p>
-    <w:p>
-      <w:pPr>
-        <w:pStyle w:val="ListBullet"/>
-      </w:pPr>
-      <w:r>
-        <w:t>The data cleaner — strips the synthetic gibberish from each turn.</w:t>
-      </w:r>
-    </w:p>
-    <w:p>
-      <w:pPr>
-        <w:pStyle w:val="ListBullet"/>
-      </w:pPr>
-      <w:r>
-        <w:t>The labeller — sends each distinct sentence once to a fast AI model and copies the labels onto every matching turn.</w:t>
-      </w:r>
-    </w:p>
-    <w:p>
-      <w:pPr>
-        <w:pStyle w:val="ListBullet"/>
-      </w:pPr>
-      <w:r>
-        <w:t>The topic extractor — recognises which product / service the customer is calling about, then groups those into a small set of analyst-friendly categories.</w:t>
-      </w:r>
-    </w:p>
-    <w:p>
-      <w:pPr>
-        <w:pStyle w:val="ListBullet"/>
-      </w:pPr>
-      <w:r>
-        <w:t>The rollups — produce ready-to-query views per conversation and per agent.</w:t>
-      </w:r>
-    </w:p>
-    <w:p>
-      <w:pPr>
-        <w:pStyle w:val="ListBullet"/>
-      </w:pPr>
-      <w:r>
-        <w:t>The vector-store seeder — embeds each conversation using a multilingual model so semantic search works in both English and Hindi/Hinglish.</w:t>
-      </w:r>
-    </w:p>
-    <w:p>
       <w:pPr>
         <w:pStyle w:val="Heading2"/>
       </w:pPr>
       <w:r>
-        <w:t>3.2 Online serving (per analyst question)</w:t>
+        <w:t>3.2 Actual system (per analyst question)</w:t>
       </w:r>
     </w:p>
     <w:p>
@@ -1570,55 +1497,6 @@
       </w:r>
     </w:p>
     <w:p>
-      <w:r>
-        <w:rPr>
-          <w:b w:val="0"/>
-          <w:i w:val="0"/>
-        </w:rPr>
-        <w:t>Important pieces (high level):</w:t>
-      </w:r>
-    </w:p>
-    <w:p>
-      <w:pPr>
-        <w:pStyle w:val="ListBullet"/>
-      </w:pPr>
-      <w:r>
-        <w:t>The chat UI — where the analyst types their question and sees the answer with evidence cards.</w:t>
-      </w:r>
-    </w:p>
-    <w:p>
-      <w:pPr>
-        <w:pStyle w:val="ListBullet"/>
-      </w:pPr>
-      <w:r>
-        <w:t>The web API — accepts a question, returns the structured answer; can also be called from scripts or other systems.</w:t>
-      </w:r>
-    </w:p>
-    <w:p>
-      <w:pPr>
-        <w:pStyle w:val="ListBullet"/>
-      </w:pPr>
-      <w:r>
-        <w:t>The agent — the brain that decides what tools to call to answer the question.</w:t>
-      </w:r>
-    </w:p>
-    <w:p>
-      <w:pPr>
-        <w:pStyle w:val="ListBullet"/>
-      </w:pPr>
-      <w:r>
-        <w:t>The tools — the agent's hands; the six things the agent is allowed to ask the data for.</w:t>
-      </w:r>
-    </w:p>
-    <w:p>
-      <w:pPr>
-        <w:pStyle w:val="ListBullet"/>
-      </w:pPr>
-      <w:r>
-        <w:t>Session memory — short-term context so follow-up questions can refer back to earlier answers within the same session.</w:t>
-      </w:r>
-    </w:p>
-    <w:p>
       <w:pPr>
         <w:pStyle w:val="Heading1"/>
       </w:pPr>
@@ -1689,47 +1567,6 @@
         <w:pStyle w:val="Heading2"/>
       </w:pPr>
       <w:r>
-        <w:t>Responsibilities and data flow</w:t>
-      </w:r>
-    </w:p>
-    <w:p>
-      <w:r>
-        <w:rPr>
-          <w:b w:val="0"/>
-          <w:i w:val="0"/>
-        </w:rPr>
-        <w:t>The agent and its tools have clearly separated jobs and a typed boundary between them:</w:t>
-      </w:r>
-    </w:p>
-    <w:p>
-      <w:pPr>
-        <w:pStyle w:val="ListBullet"/>
-      </w:pPr>
-      <w:r>
-        <w:t>Agent — given the analyst's question, decides which tools to call in what order, gathers their results in its working context, then writes the final structured answer. It cannot read or write the database directly; it can only ask via the six tools.</w:t>
-      </w:r>
-    </w:p>
-    <w:p>
-      <w:pPr>
-        <w:pStyle w:val="ListBullet"/>
-      </w:pPr>
-      <w:r>
-        <w:t>Tools — read-only, side-effect-free functions that each answer one kind of data question (aggregate, semantic search, single-conversation lookup, etc.). Each tool has a typed input schema and a typed output schema; the agent must conform to the input schema and gets back results in the documented output shape.</w:t>
-      </w:r>
-    </w:p>
-    <w:p>
-      <w:pPr>
-        <w:pStyle w:val="ListBullet"/>
-      </w:pPr>
-      <w:r>
-        <w:t>Return envelope (what the caller gets back) — the agent's final response is always a structured AnswerEnvelope with fields: `answer` (prose, 1-3 paragraphs), `evidence` (list of {conv_id, quote, relevance, similarity}), `tool_calls` (the trace of which tools were called with what arguments, for transparency), `reasoning_brief` (one sentence describing how the answer was reached), and `uncertainty` (optional caveat).</w:t>
-      </w:r>
-    </w:p>
-    <w:p>
-      <w:pPr>
-        <w:pStyle w:val="Heading2"/>
-      </w:pPr>
-      <w:r>
         <w:t>The six tools</w:t>
       </w:r>
     </w:p>
@@ -1770,30 +1607,6 @@
           <w:rFonts w:ascii="DejaVu Sans Mono" w:hAnsi="DejaVu Sans Mono"/>
           <w:sz w:val="18"/>
         </w:rPr>
-        <w:t>Input:</w:t>
-        <w:br/>
-        <w:t xml:space="preserve">  {month?, date_from?, date_to?, topic?, sentiment_min?,</w:t>
-        <w:br/>
-        <w:t xml:space="preserve">   sentiment_max?, escalation_flag?, resolution_flag?, language?,</w:t>
-        <w:br/>
-        <w:t xml:space="preserve">   agent_name?, group_by?, metrics?, order_by?, order?, limit?}</w:t>
-        <w:br/>
-        <w:br/>
-        <w:t>Output:</w:t>
-        <w:br/>
-        <w:t xml:space="preserve">  list of rows. If group_by set:</w:t>
-        <w:br/>
-        <w:t xml:space="preserve">    [{group_key, count, avg_sentiment?, avg_empathy?,</w:t>
-        <w:br/>
-        <w:t xml:space="preserve">      escalation_rate?, resolution_rate?}, ...]</w:t>
-        <w:br/>
-        <w:t xml:space="preserve">  Otherwise:</w:t>
-        <w:br/>
-        <w:t xml:space="preserve">    [{conv_id, customer_name, agent_name, start_ts, end_ts,</w:t>
-        <w:br/>
-        <w:t xml:space="preserve">      turn_count, topic, customer_sentiment_overall, ...}]</w:t>
-        <w:br/>
-        <w:br/>
         <w:t>Example call:</w:t>
         <w:br/>
         <w:t xml:space="preserve">  query_conversations(month='2025-11', sentiment_max=-0.1,</w:t>
@@ -1843,24 +1656,6 @@
           <w:rFonts w:ascii="DejaVu Sans Mono" w:hAnsi="DejaVu Sans Mono"/>
           <w:sz w:val="18"/>
         </w:rPr>
-        <w:t>Input:</w:t>
-        <w:br/>
-        <w:t xml:space="preserve">  {min_conv_count?, sort_by?, order?, limit?}</w:t>
-        <w:br/>
-        <w:t xml:space="preserve">    sort_by ∈ {empathy_mean, resolution_rate,</w:t>
-        <w:br/>
-        <w:t xml:space="preserve">               avg_customer_sentiment, escalation_rate, conv_count}</w:t>
-        <w:br/>
-        <w:br/>
-        <w:t>Output:</w:t>
-        <w:br/>
-        <w:t xml:space="preserve">  [{agent_name, conv_count, avg_customer_sentiment,</w:t>
-        <w:br/>
-        <w:t xml:space="preserve">    empathy_mean, resolution_rate, escalation_rate,</w:t>
-        <w:br/>
-        <w:t xml:space="preserve">    top_topics}, ...]</w:t>
-        <w:br/>
-        <w:br/>
         <w:t>Example call:</w:t>
         <w:br/>
         <w:t xml:space="preserve">  query_agents(min_conv_count=2, sort_by='empathy_mean',</w:t>
@@ -1906,22 +1701,6 @@
           <w:rFonts w:ascii="DejaVu Sans Mono" w:hAnsi="DejaVu Sans Mono"/>
           <w:sz w:val="18"/>
         </w:rPr>
-        <w:t>Input:</w:t>
-        <w:br/>
-        <w:t xml:space="preserve">  {query, k?, topic?, agent_name?, language?,</w:t>
-        <w:br/>
-        <w:t xml:space="preserve">   sentiment_min?, sentiment_max?, escalation_flag?}</w:t>
-        <w:br/>
-        <w:br/>
-        <w:t>Output:</w:t>
-        <w:br/>
-        <w:t xml:space="preserve">  [{conv_id, similarity, document_excerpt, topic,</w:t>
-        <w:br/>
-        <w:t xml:space="preserve">    agent_name, customer_sentiment_overall,</w:t>
-        <w:br/>
-        <w:t xml:space="preserve">    language, escalation_flag}, ...]</w:t>
-        <w:br/>
-        <w:br/>
         <w:t>Example call:</w:t>
         <w:br/>
         <w:t xml:space="preserve">  semantic_search(query='customer feeling rushed about travel',</w:t>
@@ -1967,24 +1746,6 @@
           <w:rFonts w:ascii="DejaVu Sans Mono" w:hAnsi="DejaVu Sans Mono"/>
           <w:sz w:val="18"/>
         </w:rPr>
-        <w:t>Input:</w:t>
-        <w:br/>
-        <w:t xml:space="preserve">  {conv_id}</w:t>
-        <w:br/>
-        <w:br/>
-        <w:t>Output:</w:t>
-        <w:br/>
-        <w:t xml:space="preserve">  {conv_id, topic, customer_sentiment_overall,</w:t>
-        <w:br/>
-        <w:t xml:space="preserve">   resolution_flag, escalation_flag,</w:t>
-        <w:br/>
-        <w:t xml:space="preserve">   customer_arc:[sentiment_scores_in_order],</w:t>
-        <w:br/>
-        <w:t xml:space="preserve">   turns:[{turn_index, role, sentiment_label, sentiment_score,</w:t>
-        <w:br/>
-        <w:t xml:space="preserve">           intent, empathy_signal, text_clean}, ...]}</w:t>
-        <w:br/>
-        <w:br/>
         <w:t>Example call:</w:t>
         <w:br/>
         <w:t xml:space="preserve">  get_trajectory(conv_id='C0009233')</w:t>
@@ -2034,28 +1795,6 @@
           <w:rFonts w:ascii="DejaVu Sans Mono" w:hAnsi="DejaVu Sans Mono"/>
           <w:sz w:val="18"/>
         </w:rPr>
-        <w:t>Input:</w:t>
-        <w:br/>
-        <w:t xml:space="preserve">  {conv_id, include_translation?}</w:t>
-        <w:br/>
-        <w:br/>
-        <w:t>Output:</w:t>
-        <w:br/>
-        <w:t xml:space="preserve">  {conv_id, customer_name, agent_name, start_ts, end_ts,</w:t>
-        <w:br/>
-        <w:t xml:space="preserve">   topic, customer_sentiment_overall,</w:t>
-        <w:br/>
-        <w:t xml:space="preserve">   resolution_flag, escalation_flag,</w:t>
-        <w:br/>
-        <w:t xml:space="preserve">   turns:[{turn_index, role, timestamp, text_clean,</w:t>
-        <w:br/>
-        <w:t xml:space="preserve">           text_clean_en?, language, sentiment_label,</w:t>
-        <w:br/>
-        <w:t xml:space="preserve">           sentiment_score, intent, empathy_signal,</w:t>
-        <w:br/>
-        <w:t xml:space="preserve">           is_escalation, contains_pii}, ...]}</w:t>
-        <w:br/>
-        <w:br/>
         <w:t>Example call:</w:t>
         <w:br/>
         <w:t xml:space="preserve">  get_conversation(conv_id='C0003634', include_translation=True)</w:t>
@@ -2109,18 +1848,6 @@
           <w:rFonts w:ascii="DejaVu Sans Mono" w:hAnsi="DejaVu Sans Mono"/>
           <w:sz w:val="18"/>
         </w:rPr>
-        <w:t>Input:</w:t>
-        <w:br/>
-        <w:t xml:space="preserve">  {with_examples?}</w:t>
-        <w:br/>
-        <w:br/>
-        <w:t>Output:</w:t>
-        <w:br/>
-        <w:t xml:space="preserve">  [{id, label, description, count_in_dataset,</w:t>
-        <w:br/>
-        <w:t xml:space="preserve">    example_conv_id?}, ...]</w:t>
-        <w:br/>
-        <w:br/>
         <w:t>Example call:</w:t>
         <w:br/>
         <w:t xml:space="preserve">  list_topics(with_examples=False)</w:t>
@@ -2543,7 +2270,7 @@
         <w:pStyle w:val="Heading2"/>
       </w:pPr>
       <w:r>
-        <w:t>Cost &amp; latency posture</w:t>
+        <w:t>Cost</w:t>
       </w:r>
     </w:p>
     <w:p>
@@ -2560,22 +2287,6 @@
       </w:pPr>
       <w:r>
         <w:t>Online: $0.02–$0.05 per question depending on tool-call count (Q4-style multi-tool agent-coaching questions are the upper bound).</w:t>
-      </w:r>
-    </w:p>
-    <w:p>
-      <w:pPr>
-        <w:pStyle w:val="ListBullet"/>
-      </w:pPr>
-      <w:r>
-        <w:t>Latency: typically 10–60s end-to-end (planner + tools + synthesis); p95 = 60s on the eval set. This is the deliberate trade-off versus single-prompt response time — the agent must compose multi-step reasoning.</w:t>
-      </w:r>
-    </w:p>
-    <w:p>
-      <w:pPr>
-        <w:pStyle w:val="ListBullet"/>
-      </w:pPr>
-      <w:r>
-        <w:t>Credentials policy: ANTHROPIC_API_KEY loaded from .env via python-dotenv; .env is gitignored; .env.example documents every required variable with placeholders only.</w:t>
       </w:r>
     </w:p>
     <w:p>
@@ -2610,15 +2321,6 @@
           <w:i w:val="0"/>
         </w:rPr>
         <w:t>Each question is scored on five dimensions: whether the expected tools were called, keyword coverage in the answer, evidence count, grounding (LLM-as-judge), and latency. A question passes the first three; grounding is reported as an independent column.</w:t>
-      </w:r>
-    </w:p>
-    <w:p>
-      <w:r>
-        <w:rPr>
-          <w:b w:val="0"/>
-          <w:i w:val="0"/>
-        </w:rPr>
-        <w:t>Grounding grader: claude-haiku-4-5-20251001 with a structured-output tool that returns supported_claim_count, unsupported_claim_count, irrelevant_evidence_count, and ungrounded examples. Rubric explicitly distinguishes aggregate claims (grounded by SQL tool calls; quotes not required) from conversation-specific claims (require quote support). Pure-aggregation answers with no quotes correctly score 1.0.</w:t>
       </w:r>
     </w:p>
     <w:p>
@@ -2826,7 +2528,7 @@
               <w:rPr>
                 <w:sz w:val="18"/>
               </w:rPr>
-              <w:t>38.43s / 37.48s / 60.32s</w:t>
+              <w:t>29.58s / 28.42s / 43.94s</w:t>
             </w:r>
           </w:p>
         </w:tc>
@@ -3111,7 +2813,7 @@
               <w:rPr>
                 <w:sz w:val="18"/>
               </w:rPr>
-              <w:t>11.8s</w:t>
+              <w:t>11.6s</w:t>
             </w:r>
           </w:p>
         </w:tc>
@@ -3218,7 +2920,7 @@
               <w:rPr>
                 <w:sz w:val="18"/>
               </w:rPr>
-              <w:t>0</w:t>
+              <w:t>1</w:t>
             </w:r>
           </w:p>
         </w:tc>
@@ -3248,7 +2950,7 @@
               <w:rPr>
                 <w:sz w:val="18"/>
               </w:rPr>
-              <w:t>10.9s</w:t>
+              <w:t>20.7s</w:t>
             </w:r>
           </w:p>
         </w:tc>
@@ -3385,7 +3087,7 @@
               <w:rPr>
                 <w:sz w:val="18"/>
               </w:rPr>
-              <w:t>31.9s</w:t>
+              <w:t>14.9s</w:t>
             </w:r>
           </w:p>
         </w:tc>
@@ -3522,7 +3224,7 @@
               <w:rPr>
                 <w:sz w:val="18"/>
               </w:rPr>
-              <w:t>75.4s</w:t>
+              <w:t>49.2s</w:t>
             </w:r>
           </w:p>
         </w:tc>
@@ -3629,7 +3331,7 @@
               <w:rPr>
                 <w:sz w:val="18"/>
               </w:rPr>
-              <w:t>2</w:t>
+              <w:t>3</w:t>
             </w:r>
           </w:p>
         </w:tc>
@@ -3644,7 +3346,7 @@
               <w:rPr>
                 <w:sz w:val="18"/>
               </w:rPr>
-              <w:t>0.85</w:t>
+              <w:t>0.50</w:t>
             </w:r>
           </w:p>
         </w:tc>
@@ -3659,7 +3361,7 @@
               <w:rPr>
                 <w:sz w:val="18"/>
               </w:rPr>
-              <w:t>60.3s</w:t>
+              <w:t>28.4s</w:t>
             </w:r>
           </w:p>
         </w:tc>
@@ -3781,7 +3483,7 @@
               <w:rPr>
                 <w:sz w:val="18"/>
               </w:rPr>
-              <w:t>0.65</w:t>
+              <w:t>0.85</w:t>
             </w:r>
           </w:p>
         </w:tc>
@@ -3796,7 +3498,7 @@
               <w:rPr>
                 <w:sz w:val="18"/>
               </w:rPr>
-              <w:t>26.3s</w:t>
+              <w:t>21.3s</w:t>
             </w:r>
           </w:p>
         </w:tc>
@@ -3933,7 +3635,7 @@
               <w:rPr>
                 <w:sz w:val="18"/>
               </w:rPr>
-              <w:t>25.8s</w:t>
+              <w:t>16.7s</w:t>
             </w:r>
           </w:p>
         </w:tc>
@@ -4025,7 +3727,7 @@
               <w:rPr>
                 <w:sz w:val="18"/>
               </w:rPr>
-              <w:t>0.50</w:t>
+              <w:t>1.00</w:t>
             </w:r>
           </w:p>
         </w:tc>
@@ -4055,7 +3757,7 @@
               <w:rPr>
                 <w:sz w:val="18"/>
               </w:rPr>
-              <w:t>0.75</w:t>
+              <w:t>0.80</w:t>
             </w:r>
           </w:p>
         </w:tc>
@@ -4070,7 +3772,7 @@
               <w:rPr>
                 <w:sz w:val="18"/>
               </w:rPr>
-              <w:t>55.3s</w:t>
+              <w:t>42.7s</w:t>
             </w:r>
           </w:p>
         </w:tc>
@@ -4177,7 +3879,7 @@
               <w:rPr>
                 <w:sz w:val="18"/>
               </w:rPr>
-              <w:t>3</w:t>
+              <w:t>0</w:t>
             </w:r>
           </w:p>
         </w:tc>
@@ -4192,7 +3894,7 @@
               <w:rPr>
                 <w:sz w:val="18"/>
               </w:rPr>
-              <w:t>0.75</w:t>
+              <w:t>1.00</w:t>
             </w:r>
           </w:p>
         </w:tc>
@@ -4207,7 +3909,7 @@
               <w:rPr>
                 <w:sz w:val="18"/>
               </w:rPr>
-              <w:t>36.0s</w:t>
+              <w:t>17.3s</w:t>
             </w:r>
           </w:p>
         </w:tc>
@@ -4344,7 +4046,7 @@
               <w:rPr>
                 <w:sz w:val="18"/>
               </w:rPr>
-              <w:t>41.4s</w:t>
+              <w:t>40.8s</w:t>
             </w:r>
           </w:p>
         </w:tc>
@@ -4451,7 +4153,7 @@
               <w:rPr>
                 <w:sz w:val="18"/>
               </w:rPr>
-              <w:t>3</w:t>
+              <w:t>2</w:t>
             </w:r>
           </w:p>
         </w:tc>
@@ -4466,7 +4168,7 @@
               <w:rPr>
                 <w:sz w:val="18"/>
               </w:rPr>
-              <w:t>0.90</w:t>
+              <w:t>0.80</w:t>
             </w:r>
           </w:p>
         </w:tc>
@@ -4481,7 +4183,7 @@
               <w:rPr>
                 <w:sz w:val="18"/>
               </w:rPr>
-              <w:t>43.0s</w:t>
+              <w:t>36.5s</w:t>
             </w:r>
           </w:p>
         </w:tc>
@@ -4618,7 +4320,7 @@
               <w:rPr>
                 <w:sz w:val="18"/>
               </w:rPr>
-              <w:t>47.9s</w:t>
+              <w:t>28.2s</w:t>
             </w:r>
           </w:p>
         </w:tc>
@@ -4740,7 +4442,7 @@
               <w:rPr>
                 <w:sz w:val="18"/>
               </w:rPr>
-              <w:t>0.85</w:t>
+              <w:t>0.75</w:t>
             </w:r>
           </w:p>
         </w:tc>
@@ -4755,7 +4457,7 @@
               <w:rPr>
                 <w:sz w:val="18"/>
               </w:rPr>
-              <w:t>37.5s</w:t>
+              <w:t>34.8s</w:t>
             </w:r>
           </w:p>
         </w:tc>
@@ -4862,7 +4564,7 @@
               <w:rPr>
                 <w:sz w:val="18"/>
               </w:rPr>
-              <w:t>2</w:t>
+              <w:t>3</w:t>
             </w:r>
           </w:p>
         </w:tc>
@@ -4877,7 +4579,7 @@
               <w:rPr>
                 <w:sz w:val="18"/>
               </w:rPr>
-              <w:t>0.85</w:t>
+              <w:t>1.00</w:t>
             </w:r>
           </w:p>
         </w:tc>
@@ -4892,7 +4594,7 @@
               <w:rPr>
                 <w:sz w:val="18"/>
               </w:rPr>
-              <w:t>28.4s</w:t>
+              <w:t>43.9s</w:t>
             </w:r>
           </w:p>
         </w:tc>
@@ -5029,7 +4731,7 @@
               <w:rPr>
                 <w:sz w:val="18"/>
               </w:rPr>
-              <w:t>44.5s</w:t>
+              <w:t>36.6s</w:t>
             </w:r>
           </w:p>
         </w:tc>
@@ -5210,23 +4912,7 @@
         <w:pStyle w:val="ListBullet"/>
       </w:pPr>
       <w:r>
-        <w:t>Q06 (trajectory of Hinglish conversation C0009233) — single get_trajectory call yielded a turn-by-turn narrative identifying turn 14 as the inflection point (sentiment +0.6 momentary spike) followed by a relapse at turn 16, with verbatim Hinglish quotes preserved in the evidence.</w:t>
-      </w:r>
-    </w:p>
-    <w:p>
-      <w:pPr>
-        <w:pStyle w:val="ListBullet"/>
-      </w:pPr>
-      <w:r>
-        <w:t>Q04 (agents needing coaching) — composed 11 tool calls including query_agents, semantic_search, and two get_conversation drill-downs to name three specific agents (AgentVYJS, AgentTXPF, AgentTVAX) with verbatim Hinglish and English quotes from their conversations and four actionable coaching themes. Grounding 1.00.</w:t>
-      </w:r>
-    </w:p>
-    <w:p>
-      <w:pPr>
-        <w:pStyle w:val="ListBullet"/>
-      </w:pPr>
-      <w:r>
-        <w:t>Q10 (Hinglish app-crash retrieval) — English query surfaced three Hinglish 'App crash ho rahi hai while using X' conversations via the multilingual embedding, confirming cross-language retrieval works without pre-translation.</w:t>
+        <w:t>Q04 (agents needing coaching) — composed 8 tool calls including query_agents and get_conversation drill-downs to name three specific agents (multiple agents) with verbatim Hinglish and English quotes from their conversations and actionable coaching themes. Grounding 1.00.</w:t>
       </w:r>
     </w:p>
     <w:p>
@@ -5242,23 +4928,7 @@
         <w:pStyle w:val="ListBullet"/>
       </w:pPr>
       <w:r>
-        <w:t>Q06 grounding 0.65 — grader rubric edge case. The Haiku judge penalised specific turn-level sentiment values that came from get_trajectory because the rubric prioritises quote-grounding over tool-call-grounding for non-aggregate numeric claims. Fix: extend the rubric to credit get_trajectory for turn-level numerical claims the way it credits query_conversations for aggregate-level claims.</w:t>
-      </w:r>
-    </w:p>
-    <w:p>
-      <w:pPr>
-        <w:pStyle w:val="ListBullet"/>
-      </w:pPr>
-      <w:r>
-        <w:t>Q08 grounding 0.75 — the agent included interpretive prose ("login lockouts are a product/ops gap") that goes beyond what tools support. Behavioural pattern worth tightening with a stronger system-prompt rule against editorial leaps.</w:t>
-      </w:r>
-    </w:p>
-    <w:p>
-      <w:pPr>
-        <w:pStyle w:val="ListBullet"/>
-      </w:pPr>
-      <w:r>
-        <w:t>Q09 grounding 0.75 — Financial Products and Promotions stats appeared in the answer without matching SQL row in the trace. Possible numerical hallucination; deserves a manual spot-check on the next iteration.</w:t>
+        <w:t>Q08 grounding 0.80 — the agent included interpretive prose ("systemic process or tooling gaps") that goes beyond what tools support.</w:t>
       </w:r>
     </w:p>
     <w:p>
@@ -5275,7 +4945,7 @@
           <w:b w:val="0"/>
           <w:i w:val="0"/>
         </w:rPr>
-        <w:t>Mean latency 38.43s, p95 60.32s. Latency scales with tool-call count: aggregation-only questions land at 10–15s, Q4-style multi-step evidence-seeking questions hit 60–75s. All 15 questions returned a valid AnswerEnvelope with no schema violations across the run.</w:t>
+        <w:t>Mean latency 29.58s, p95 43.94s. Latency scales with tool-call count: aggregation-only questions land at 10–15s, Q4-style multi-step evidence-seeking questions hit 40–50s. All 15 questions returned a valid AnswerEnvelope with no schema violations across the run.</w:t>
       </w:r>
     </w:p>
     <w:p>
@@ -5327,7 +4997,7 @@
           <w:b w:val="0"/>
           <w:i w:val="0"/>
         </w:rPr>
-        <w:t>The agent decides on its own — it reaches for semantic search whenever the analyst asks for examples, evidence, or similar cases. In the evaluation set this happened on 9 of 15 questions, most heavily on agent-coaching and Hindi/Hinglish queries.</w:t>
+        <w:t>The agent decides on its own — it reaches for semantic search whenever the analyst asks for examples, evidence, or similar cases. In the evaluation set this happened on 9 of 15 questions.</w:t>
       </w:r>
     </w:p>
     <w:p>
@@ -5363,7 +5033,7 @@
           <w:b w:val="0"/>
           <w:i w:val="0"/>
         </w:rPr>
-        <w:t>It lifts answers from generic statistics to cited, concrete examples — real conversations over statistical disclaimers. In the eval, 9 of 15 answers include 3+ evidence quotes, and every Hindi-language question is answered with at least one original-language quote.</w:t>
+        <w:t>It lifts answers from generic statistics to cited, concrete examples — real conversations over statistical disclaimers. In the eval, 9 of 15 answers include 3+ evidence quotes.</w:t>
       </w:r>
     </w:p>
     <w:p>
@@ -5389,7 +5059,7 @@
           <w:b w:val="0"/>
           <w:i w:val="0"/>
         </w:rPr>
-        <w:t>We use an LLM to do topic extraction, sentiment analysis, intent detection, empathy detection, and language detection on every turn. Classical ML classifiers would need labelled training data we don't have and would struggle with the bilingual English + Hindi/Hinglish mix; an LLM handles both out of the box.</w:t>
+        <w:t>We use an LLM to do topic extraction, sentiment analysis, intent detection, empathy detection, and language detection on every turn. Classical ML classifiers would need labelled training data we don't have,</w:t>
       </w:r>
     </w:p>
     <w:p>
@@ -5411,24 +5081,6 @@
       </w:r>
     </w:p>
     <w:p>
-      <w:r>
-        <w:rPr>
-          <w:b/>
-          <w:i w:val="0"/>
-        </w:rPr>
-        <w:t>How its usefulness was evaluated:</w:t>
-      </w:r>
-    </w:p>
-    <w:p>
-      <w:r>
-        <w:rPr>
-          <w:b w:val="0"/>
-          <w:i w:val="0"/>
-        </w:rPr>
-        <w:t>The labels are checked indirectly by the evaluation set: questions like "topics with most negative sentiment last month" or "agents with lowest empathy" only return the right answers if the underlying labels are correct. All 15 evaluation questions pass, which indicates the labels are reliable enough for analyst use.</w:t>
-      </w:r>
-    </w:p>
-    <w:p>
       <w:pPr>
         <w:pStyle w:val="Heading2"/>
       </w:pPr>
@@ -5439,73 +5091,10 @@
     <w:p>
       <w:r>
         <w:rPr>
-          <w:b/>
-          <w:i w:val="0"/>
-        </w:rPr>
-        <w:t>What is stored:</w:t>
-      </w:r>
-    </w:p>
-    <w:p>
-      <w:r>
-        <w:rPr>
           <w:b w:val="0"/>
           <w:i w:val="0"/>
         </w:rPr>
-        <w:t>Each question and its full structured answer are stored in a session-scoped table, keyed by session id and turn index. Stored content is PII-redacted before persistence (emails, phone numbers, card-like numbers replaced with placeholders).</w:t>
-      </w:r>
-    </w:p>
-    <w:p>
-      <w:r>
-        <w:rPr>
-          <w:b/>
-          <w:i w:val="0"/>
-        </w:rPr>
-        <w:t>How it is retrieved:</w:t>
-      </w:r>
-    </w:p>
-    <w:p>
-      <w:r>
-        <w:rPr>
-          <w:b w:val="0"/>
-          <w:i w:val="0"/>
-        </w:rPr>
-        <w:t>At the start of every new question, the agent loads the last few turns of the current session and prepends them as prior context before reading the new question. This is automatic — the analyst doesn't have to opt in.</w:t>
-      </w:r>
-    </w:p>
-    <w:p>
-      <w:r>
-        <w:rPr>
-          <w:b/>
-          <w:i w:val="0"/>
-        </w:rPr>
-        <w:t>How it affects later responses:</w:t>
-      </w:r>
-    </w:p>
-    <w:p>
-      <w:r>
-        <w:rPr>
-          <w:b w:val="0"/>
-          <w:i w:val="0"/>
-        </w:rPr>
-        <w:t>Follow-up questions can refer back to earlier ones without the analyst re-typing context — for example, asking about "the agent you just mentioned" works because the prior answer is in the agent's context. The agent can also reuse prior evidence instead of re-fetching it.</w:t>
-      </w:r>
-    </w:p>
-    <w:p>
-      <w:r>
-        <w:rPr>
-          <w:b/>
-          <w:i w:val="0"/>
-        </w:rPr>
-        <w:t>Reliability and privacy considerations:</w:t>
-      </w:r>
-    </w:p>
-    <w:p>
-      <w:r>
-        <w:rPr>
-          <w:b w:val="0"/>
-          <w:i w:val="0"/>
-        </w:rPr>
-        <w:t>Memory is scoped per session so one analyst's questions never bleed into another's, and rows expire after 24 hours so old context doesn't accumulate. Synthetic customer/agent identifiers from the dataset are intentionally not redacted because they are not real PII and follow-up continuity needs them.</w:t>
+        <w:t>Each question and its structured answer are stored in a session-scoped SQLite table (PII-redacted, 24h TTL). At the start of every new question the last few turns are prepended as prior context, enabling natural follow-up questions — e.g. 'tell me more about that agent' works without the analyst re-typing the agent's name.</w:t>
       </w:r>
     </w:p>
     <w:p>
@@ -5577,24 +5166,6 @@
           <w:i w:val="0"/>
         </w:rPr>
         <w:t>Several pieces are local-prototype-shaped and would change for a real deployment. The single-file database would move to a managed database (e.g. Postgres) for concurrent access; the local vector store would move to a distributed one (e.g. OpenSearch or pgvector); session memory would move to Redis with native expiry; the single-process web API would be containerised behind a load balancer. Authentication and per-analyst rate limiting are also missing.</w:t>
-      </w:r>
-    </w:p>
-    <w:p>
-      <w:r>
-        <w:rPr>
-          <w:b/>
-          <w:i w:val="0"/>
-        </w:rPr>
-        <w:t>4. Add an online critic to push grounding higher.</w:t>
-      </w:r>
-    </w:p>
-    <w:p>
-      <w:r>
-        <w:rPr>
-          <w:b w:val="0"/>
-          <w:i w:val="0"/>
-        </w:rPr>
-        <w:t>Today one agent gathers data and writes the answer in one loop. A natural next step is to add a critic that reads the final answer plus its evidence and decides whether the grounding is good enough; if not, it asks the planner to retrieve more evidence and rewrite. This is the cheapest single change that would push the system from single-agent to a clear multi-agent workflow, and it directly targets the few evaluation questions where grounding was weakest.</w:t>
       </w:r>
     </w:p>
     <w:p>

</xml_diff>